<commit_message>
chore(template): first-page-only footer stamp, gray; pages 2+ keep just the page number
Users read the template's "October 2022" footer as a date of the CV
itself. Reword it to "WCM CV template, October 2022", gray it (808080),
and show it on page 1 only. Pages 2+ drop the text and the 15 literal
tabs that pushed the PAGE field around, leaving a right-aligned page
number.

Docx-only change; no code path reads or writes the footer. Render gate
over the 66-CV farm: paragraph CHANGED 0, and the only document.xml
delta on every CV is the added <w:titlePg/> that enables the first-page
footer.
</commit_message>
<xml_diff>
--- a/key_files/wcm_cv_template_faculty_october_2022_final.docx
+++ b/key_files/wcm_cv_template_faculty_october_2022_final.docx
@@ -12105,6 +12105,7 @@
       <w:pgSz w:w="12240" w:h="15840"/>
       <w:pgMar w:top="864" w:right="864" w:bottom="864" w:left="864" w:header="720" w:footer="720" w:gutter="0"/>
       <w:cols w:space="720"/>
+      <w:titlePg/>
       <w:docGrid w:linePitch="360"/>
     </w:sectPr>
   </w:body>
@@ -12145,7 +12146,7 @@
         <w:tab w:val="clear" w:pos="4680"/>
         <w:tab w:val="clear" w:pos="9360"/>
       </w:tabs>
-      <w:jc w:val="center"/>
+      <w:jc w:val="right"/>
       <w:rPr>
         <w:rFonts w:ascii="Arial" w:hAnsi="Arial" w:cs="Arial"/>
         <w:caps/>
@@ -12154,140 +12155,6 @@
         <w:szCs w:val="18"/>
       </w:rPr>
     </w:pPr>
-    <w:r>
-      <w:rPr>
-        <w:rFonts w:ascii="Arial" w:hAnsi="Arial" w:cs="Arial"/>
-        <w:sz w:val="18"/>
-        <w:szCs w:val="18"/>
-      </w:rPr>
-      <w:t>October</w:t>
-    </w:r>
-    <w:r>
-      <w:rPr>
-        <w:rFonts w:ascii="Arial" w:hAnsi="Arial" w:cs="Arial"/>
-        <w:caps/>
-        <w:sz w:val="18"/>
-        <w:szCs w:val="18"/>
-      </w:rPr>
-      <w:t xml:space="preserve"> 2022 </w:t>
-    </w:r>
-    <w:r>
-      <w:rPr>
-        <w:rFonts w:ascii="Arial" w:hAnsi="Arial" w:cs="Arial"/>
-        <w:caps/>
-        <w:sz w:val="18"/>
-        <w:szCs w:val="18"/>
-      </w:rPr>
-      <w:tab/>
-    </w:r>
-    <w:r>
-      <w:rPr>
-        <w:rFonts w:ascii="Arial" w:hAnsi="Arial" w:cs="Arial"/>
-        <w:caps/>
-        <w:sz w:val="18"/>
-        <w:szCs w:val="18"/>
-      </w:rPr>
-      <w:tab/>
-    </w:r>
-    <w:r>
-      <w:rPr>
-        <w:rFonts w:ascii="Arial" w:hAnsi="Arial" w:cs="Arial"/>
-        <w:caps/>
-        <w:sz w:val="18"/>
-        <w:szCs w:val="18"/>
-      </w:rPr>
-      <w:tab/>
-    </w:r>
-    <w:r>
-      <w:rPr>
-        <w:rFonts w:ascii="Arial" w:hAnsi="Arial" w:cs="Arial"/>
-        <w:caps/>
-        <w:sz w:val="18"/>
-        <w:szCs w:val="18"/>
-      </w:rPr>
-      <w:tab/>
-    </w:r>
-    <w:r>
-      <w:rPr>
-        <w:rFonts w:ascii="Arial" w:hAnsi="Arial" w:cs="Arial"/>
-        <w:caps/>
-        <w:sz w:val="18"/>
-        <w:szCs w:val="18"/>
-      </w:rPr>
-      <w:tab/>
-    </w:r>
-    <w:r>
-      <w:rPr>
-        <w:rFonts w:ascii="Arial" w:hAnsi="Arial" w:cs="Arial"/>
-        <w:caps/>
-        <w:sz w:val="18"/>
-        <w:szCs w:val="18"/>
-      </w:rPr>
-      <w:tab/>
-    </w:r>
-    <w:r>
-      <w:rPr>
-        <w:rFonts w:ascii="Arial" w:hAnsi="Arial" w:cs="Arial"/>
-        <w:caps/>
-        <w:sz w:val="18"/>
-        <w:szCs w:val="18"/>
-      </w:rPr>
-      <w:tab/>
-    </w:r>
-    <w:r>
-      <w:rPr>
-        <w:rFonts w:ascii="Arial" w:hAnsi="Arial" w:cs="Arial"/>
-        <w:caps/>
-        <w:sz w:val="18"/>
-        <w:szCs w:val="18"/>
-      </w:rPr>
-      <w:tab/>
-    </w:r>
-    <w:r>
-      <w:rPr>
-        <w:rFonts w:ascii="Arial" w:hAnsi="Arial" w:cs="Arial"/>
-        <w:caps/>
-        <w:sz w:val="18"/>
-        <w:szCs w:val="18"/>
-      </w:rPr>
-      <w:tab/>
-    </w:r>
-    <w:r>
-      <w:rPr>
-        <w:rFonts w:ascii="Arial" w:hAnsi="Arial" w:cs="Arial"/>
-        <w:caps/>
-        <w:sz w:val="18"/>
-        <w:szCs w:val="18"/>
-      </w:rPr>
-      <w:tab/>
-    </w:r>
-    <w:r>
-      <w:rPr>
-        <w:rFonts w:ascii="Arial" w:hAnsi="Arial" w:cs="Arial"/>
-        <w:caps/>
-        <w:sz w:val="18"/>
-        <w:szCs w:val="18"/>
-      </w:rPr>
-      <w:tab/>
-    </w:r>
-    <w:r>
-      <w:rPr>
-        <w:rFonts w:ascii="Arial" w:hAnsi="Arial" w:cs="Arial"/>
-        <w:caps/>
-        <w:sz w:val="18"/>
-        <w:szCs w:val="18"/>
-      </w:rPr>
-      <w:tab/>
-    </w:r>
-    <w:r>
-      <w:rPr>
-        <w:rFonts w:ascii="Arial" w:hAnsi="Arial" w:cs="Arial"/>
-        <w:caps/>
-        <w:sz w:val="18"/>
-        <w:szCs w:val="18"/>
-      </w:rPr>
-      <w:tab/>
-    </w:r>
     <w:r>
       <w:rPr>
         <w:rFonts w:ascii="Arial" w:hAnsi="Arial" w:cs="Arial"/>
@@ -12353,34 +12220,11 @@
     <w:r>
       <w:rPr>
         <w:rFonts w:ascii="Arial" w:hAnsi="Arial" w:cs="Arial"/>
+        <w:color w:val="808080"/>
         <w:sz w:val="18"/>
         <w:szCs w:val="18"/>
       </w:rPr>
-      <w:t>October 2022</w:t>
-    </w:r>
-    <w:r>
-      <w:rPr>
-        <w:rFonts w:ascii="Arial" w:hAnsi="Arial" w:cs="Arial"/>
-        <w:sz w:val="18"/>
-        <w:szCs w:val="18"/>
-      </w:rPr>
-      <w:tab/>
-    </w:r>
-    <w:r>
-      <w:rPr>
-        <w:rFonts w:ascii="Arial" w:hAnsi="Arial" w:cs="Arial"/>
-        <w:sz w:val="18"/>
-        <w:szCs w:val="18"/>
-      </w:rPr>
-      <w:tab/>
-    </w:r>
-    <w:r>
-      <w:rPr>
-        <w:rFonts w:ascii="Arial" w:hAnsi="Arial" w:cs="Arial"/>
-        <w:sz w:val="18"/>
-        <w:szCs w:val="18"/>
-      </w:rPr>
-      <w:tab/>
+      <w:t>WCM CV template, October 2022</w:t>
     </w:r>
     <w:sdt>
       <w:sdtPr>

</xml_diff>